<commit_message>
Atualizando documentacoes existentes e adicionando novas
</commit_message>
<xml_diff>
--- a/DOCS/DATA WAREHOUSE UFC.docx
+++ b/DOCS/DATA WAREHOUSE UFC.docx
@@ -2148,7 +2148,7 @@
           <w:b/>
           <w:bCs/>
         </w:rPr>
-        <w:t>CAMPOS PRESENTES NOS DOIS ARQUIVOS CSV UTILIZADOS</w:t>
+        <w:t>CAMPOS PRESENTES NOS ARQUIVOS CSV UTILIZADOS</w:t>
       </w:r>
     </w:p>
     <w:p>
@@ -8254,9 +8254,471 @@
     </w:p>
     <w:p>
       <w:pPr>
-        <w:jc w:val="both"/>
-      </w:pPr>
-      <w:r>
+        <w:ind w:firstLine="708"/>
+        <w:jc w:val="both"/>
+        <w:rPr>
+          <w:rFonts w:ascii="Arial" w:hAnsi="Arial" w:cs="Arial"/>
+        </w:rPr>
+      </w:pPr>
+      <w:r>
+        <w:rPr>
+          <w:rFonts w:ascii="Arial" w:hAnsi="Arial" w:cs="Arial"/>
+        </w:rPr>
+        <w:lastRenderedPageBreak/>
+        <w:t xml:space="preserve">O processo de análise de dados foi desenvolvido com a utilização da ferramenta </w:t>
+      </w:r>
+      <w:r>
+        <w:rPr>
+          <w:rFonts w:ascii="Arial" w:hAnsi="Arial" w:cs="Arial"/>
+          <w:i/>
+          <w:iCs/>
+        </w:rPr>
+        <w:t>Orange Data Mining</w:t>
+      </w:r>
+      <w:r>
+        <w:rPr>
+          <w:rFonts w:ascii="Arial" w:hAnsi="Arial" w:cs="Arial"/>
+        </w:rPr>
+        <w:t>. Esta ferramenta possibilitou a manipulação dos dados para uma posterior análise por meio de gráficos.</w:t>
+      </w:r>
+    </w:p>
+    <w:p>
+      <w:pPr>
+        <w:ind w:firstLine="708"/>
+        <w:jc w:val="both"/>
+        <w:rPr>
+          <w:rFonts w:ascii="Arial" w:hAnsi="Arial" w:cs="Arial"/>
+        </w:rPr>
+      </w:pPr>
+    </w:p>
+    <w:p>
+      <w:pPr>
+        <w:ind w:firstLine="708"/>
+        <w:jc w:val="both"/>
+        <w:rPr>
+          <w:rFonts w:ascii="Arial" w:hAnsi="Arial" w:cs="Arial"/>
+        </w:rPr>
+      </w:pPr>
+      <w:r>
+        <w:rPr>
+          <w:rFonts w:ascii="Arial" w:hAnsi="Arial" w:cs="Arial"/>
+        </w:rPr>
+        <w:drawing>
+          <wp:inline distT="0" distB="0" distL="0" distR="0" wp14:anchorId="55E4EE2E" wp14:editId="209D8322">
+            <wp:extent cx="5400040" cy="4047490"/>
+            <wp:effectExtent l="0" t="0" r="0" b="0"/>
+            <wp:docPr id="2102376101" name="Picture 1"/>
+            <wp:cNvGraphicFramePr>
+              <a:graphicFrameLocks xmlns:a="http://schemas.openxmlformats.org/drawingml/2006/main" noChangeAspect="1"/>
+            </wp:cNvGraphicFramePr>
+            <a:graphic xmlns:a="http://schemas.openxmlformats.org/drawingml/2006/main">
+              <a:graphicData uri="http://schemas.openxmlformats.org/drawingml/2006/picture">
+                <pic:pic xmlns:pic="http://schemas.openxmlformats.org/drawingml/2006/picture">
+                  <pic:nvPicPr>
+                    <pic:cNvPr id="2102376101" name=""/>
+                    <pic:cNvPicPr/>
+                  </pic:nvPicPr>
+                  <pic:blipFill>
+                    <a:blip r:embed="rId7"/>
+                    <a:stretch>
+                      <a:fillRect/>
+                    </a:stretch>
+                  </pic:blipFill>
+                  <pic:spPr>
+                    <a:xfrm>
+                      <a:off x="0" y="0"/>
+                      <a:ext cx="5400040" cy="4047490"/>
+                    </a:xfrm>
+                    <a:prstGeom prst="rect">
+                      <a:avLst/>
+                    </a:prstGeom>
+                  </pic:spPr>
+                </pic:pic>
+              </a:graphicData>
+            </a:graphic>
+          </wp:inline>
+        </w:drawing>
+      </w:r>
+    </w:p>
+    <w:p>
+      <w:pPr>
+        <w:ind w:firstLine="708"/>
+        <w:jc w:val="both"/>
+        <w:rPr>
+          <w:rFonts w:ascii="Arial" w:hAnsi="Arial" w:cs="Arial"/>
+        </w:rPr>
+      </w:pPr>
+      <w:r>
+        <w:rPr>
+          <w:rFonts w:ascii="Arial" w:hAnsi="Arial" w:cs="Arial"/>
+        </w:rPr>
+        <w:t>Figura 1 – Tabelas e gráficos no Orange Data Mining</w:t>
+      </w:r>
+    </w:p>
+    <w:p>
+      <w:pPr>
+        <w:ind w:firstLine="708"/>
+        <w:jc w:val="both"/>
+        <w:rPr>
+          <w:rFonts w:ascii="Arial" w:hAnsi="Arial" w:cs="Arial"/>
+        </w:rPr>
+      </w:pPr>
+      <w:r>
+        <w:rPr>
+          <w:rFonts w:ascii="Arial" w:hAnsi="Arial" w:cs="Arial"/>
+        </w:rPr>
+        <w:t>A seguir, são apresentados alguns gráficos gerados durante a análise exploratória.</w:t>
+      </w:r>
+    </w:p>
+    <w:p>
+      <w:pPr>
+        <w:ind w:firstLine="708"/>
+        <w:jc w:val="both"/>
+        <w:rPr>
+          <w:rFonts w:ascii="Arial" w:hAnsi="Arial" w:cs="Arial"/>
+        </w:rPr>
+      </w:pPr>
+      <w:r>
+        <w:rPr>
+          <w:rFonts w:ascii="Arial" w:hAnsi="Arial" w:cs="Arial"/>
+        </w:rPr>
+        <w:lastRenderedPageBreak/>
+        <w:drawing>
+          <wp:inline distT="0" distB="0" distL="0" distR="0" wp14:anchorId="1E6540A3" wp14:editId="3E1CFE09">
+            <wp:extent cx="5400040" cy="3542665"/>
+            <wp:effectExtent l="0" t="0" r="0" b="635"/>
+            <wp:docPr id="268586258" name="Picture 1"/>
+            <wp:cNvGraphicFramePr>
+              <a:graphicFrameLocks xmlns:a="http://schemas.openxmlformats.org/drawingml/2006/main" noChangeAspect="1"/>
+            </wp:cNvGraphicFramePr>
+            <a:graphic xmlns:a="http://schemas.openxmlformats.org/drawingml/2006/main">
+              <a:graphicData uri="http://schemas.openxmlformats.org/drawingml/2006/picture">
+                <pic:pic xmlns:pic="http://schemas.openxmlformats.org/drawingml/2006/picture">
+                  <pic:nvPicPr>
+                    <pic:cNvPr id="268586258" name=""/>
+                    <pic:cNvPicPr/>
+                  </pic:nvPicPr>
+                  <pic:blipFill>
+                    <a:blip r:embed="rId8"/>
+                    <a:stretch>
+                      <a:fillRect/>
+                    </a:stretch>
+                  </pic:blipFill>
+                  <pic:spPr>
+                    <a:xfrm>
+                      <a:off x="0" y="0"/>
+                      <a:ext cx="5400040" cy="3542665"/>
+                    </a:xfrm>
+                    <a:prstGeom prst="rect">
+                      <a:avLst/>
+                    </a:prstGeom>
+                  </pic:spPr>
+                </pic:pic>
+              </a:graphicData>
+            </a:graphic>
+          </wp:inline>
+        </w:drawing>
+      </w:r>
+    </w:p>
+    <w:p>
+      <w:pPr>
+        <w:ind w:firstLine="708"/>
+        <w:jc w:val="both"/>
+        <w:rPr>
+          <w:rFonts w:ascii="Arial" w:hAnsi="Arial" w:cs="Arial"/>
+        </w:rPr>
+      </w:pPr>
+      <w:r>
+        <w:rPr>
+          <w:rFonts w:ascii="Arial" w:hAnsi="Arial" w:cs="Arial"/>
+        </w:rPr>
+        <w:t>Figura 2 – Gráfico de violino c</w:t>
+      </w:r>
+      <w:r>
+        <w:rPr>
+          <w:rFonts w:ascii="Arial" w:hAnsi="Arial" w:cs="Arial"/>
+        </w:rPr>
+        <w:t>orrelacionando o número do round em que a luta acabou com o método de vitória</w:t>
+      </w:r>
+    </w:p>
+    <w:p>
+      <w:pPr>
+        <w:ind w:firstLine="708"/>
+        <w:jc w:val="both"/>
+        <w:rPr>
+          <w:rFonts w:ascii="Arial" w:hAnsi="Arial" w:cs="Arial"/>
+        </w:rPr>
+      </w:pPr>
+      <w:r>
+        <w:rPr>
+          <w:rFonts w:ascii="Arial" w:hAnsi="Arial" w:cs="Arial"/>
+        </w:rPr>
+        <w:t>A figura 2 apresenta um</w:t>
+      </w:r>
+      <w:r>
+        <w:rPr>
+          <w:rFonts w:ascii="Arial" w:hAnsi="Arial" w:cs="Arial"/>
+        </w:rPr>
+        <w:t xml:space="preserve"> gráfico de violino </w:t>
+      </w:r>
+      <w:r>
+        <w:rPr>
+          <w:rFonts w:ascii="Arial" w:hAnsi="Arial" w:cs="Arial"/>
+        </w:rPr>
+        <w:t>com a</w:t>
+      </w:r>
+      <w:r>
+        <w:rPr>
+          <w:rFonts w:ascii="Arial" w:hAnsi="Arial" w:cs="Arial"/>
+        </w:rPr>
+        <w:t xml:space="preserve"> distribuição do round de término das lutas (ROUND) de acordo com o método de resultado (METHOD). Observa-se que resultados por KO/TKO e finalização (</w:t>
+      </w:r>
+      <w:proofErr w:type="spellStart"/>
+      <w:r>
+        <w:rPr>
+          <w:rFonts w:ascii="Arial" w:hAnsi="Arial" w:cs="Arial"/>
+        </w:rPr>
+        <w:t>Submission</w:t>
+      </w:r>
+      <w:proofErr w:type="spellEnd"/>
+      <w:r>
+        <w:rPr>
+          <w:rFonts w:ascii="Arial" w:hAnsi="Arial" w:cs="Arial"/>
+        </w:rPr>
+        <w:t>) concentram-se principalmente nos primeiros rounds, especialmente entre o primeiro e o segundo, indicando que esse tipo de desfecho tende a ocorrer mais cedo na luta. Em contraste, os diferentes tipos de decisão dos juízes (</w:t>
+      </w:r>
+      <w:proofErr w:type="spellStart"/>
+      <w:r>
+        <w:rPr>
+          <w:rFonts w:ascii="Arial" w:hAnsi="Arial" w:cs="Arial"/>
+        </w:rPr>
+        <w:t>unanimous</w:t>
+      </w:r>
+      <w:proofErr w:type="spellEnd"/>
+      <w:r>
+        <w:rPr>
+          <w:rFonts w:ascii="Arial" w:hAnsi="Arial" w:cs="Arial"/>
+        </w:rPr>
+        <w:t xml:space="preserve">, split e </w:t>
+      </w:r>
+      <w:proofErr w:type="spellStart"/>
+      <w:r>
+        <w:rPr>
+          <w:rFonts w:ascii="Arial" w:hAnsi="Arial" w:cs="Arial"/>
+        </w:rPr>
+        <w:t>majority</w:t>
+      </w:r>
+      <w:proofErr w:type="spellEnd"/>
+      <w:r>
+        <w:rPr>
+          <w:rFonts w:ascii="Arial" w:hAnsi="Arial" w:cs="Arial"/>
+        </w:rPr>
+        <w:t xml:space="preserve">) apresentam maior concentração em torno do terceiro round, refletindo lutas que chegam ao tempo regulamentar. Métodos menos frequentes, como desqualificação (DQ), interrupção médica (TKO – </w:t>
+      </w:r>
+      <w:proofErr w:type="spellStart"/>
+      <w:r>
+        <w:rPr>
+          <w:rFonts w:ascii="Arial" w:hAnsi="Arial" w:cs="Arial"/>
+        </w:rPr>
+        <w:t>Doctor’s</w:t>
+      </w:r>
+      <w:proofErr w:type="spellEnd"/>
+      <w:r>
+        <w:rPr>
+          <w:rFonts w:ascii="Arial" w:hAnsi="Arial" w:cs="Arial"/>
+        </w:rPr>
+        <w:t xml:space="preserve"> </w:t>
+      </w:r>
+      <w:proofErr w:type="spellStart"/>
+      <w:r>
+        <w:rPr>
+          <w:rFonts w:ascii="Arial" w:hAnsi="Arial" w:cs="Arial"/>
+        </w:rPr>
+        <w:t>Stoppage</w:t>
+      </w:r>
+      <w:proofErr w:type="spellEnd"/>
+      <w:r>
+        <w:rPr>
+          <w:rFonts w:ascii="Arial" w:hAnsi="Arial" w:cs="Arial"/>
+        </w:rPr>
+        <w:t xml:space="preserve">) e </w:t>
+      </w:r>
+      <w:proofErr w:type="spellStart"/>
+      <w:r>
+        <w:rPr>
+          <w:rFonts w:ascii="Arial" w:hAnsi="Arial" w:cs="Arial"/>
+        </w:rPr>
+        <w:t>could</w:t>
+      </w:r>
+      <w:proofErr w:type="spellEnd"/>
+      <w:r>
+        <w:rPr>
+          <w:rFonts w:ascii="Arial" w:hAnsi="Arial" w:cs="Arial"/>
+        </w:rPr>
+        <w:t xml:space="preserve"> </w:t>
+      </w:r>
+      <w:proofErr w:type="spellStart"/>
+      <w:r>
+        <w:rPr>
+          <w:rFonts w:ascii="Arial" w:hAnsi="Arial" w:cs="Arial"/>
+        </w:rPr>
+        <w:t>not</w:t>
+      </w:r>
+      <w:proofErr w:type="spellEnd"/>
+      <w:r>
+        <w:rPr>
+          <w:rFonts w:ascii="Arial" w:hAnsi="Arial" w:cs="Arial"/>
+        </w:rPr>
+        <w:t xml:space="preserve"> continue, apresentam distribuições mais dispersas e menor densidade de observações. De modo geral, a figura evidencia que métodos de finalização direta tendem a encerrar a luta mais precocemente, enquanto decisões estão associadas a combates mais longos.</w:t>
+      </w:r>
+    </w:p>
+    <w:p>
+      <w:pPr>
+        <w:ind w:firstLine="708"/>
+        <w:jc w:val="both"/>
+        <w:rPr>
+          <w:rFonts w:ascii="Arial" w:hAnsi="Arial" w:cs="Arial"/>
+        </w:rPr>
+      </w:pPr>
+      <w:r>
+        <w:rPr>
+          <w:rFonts w:ascii="Arial" w:hAnsi="Arial" w:cs="Arial"/>
+        </w:rPr>
+        <w:lastRenderedPageBreak/>
+        <w:drawing>
+          <wp:inline distT="0" distB="0" distL="0" distR="0" wp14:anchorId="0067B841" wp14:editId="40CABF38">
+            <wp:extent cx="5400040" cy="2856230"/>
+            <wp:effectExtent l="0" t="0" r="0" b="1270"/>
+            <wp:docPr id="855984060" name="Picture 1"/>
+            <wp:cNvGraphicFramePr>
+              <a:graphicFrameLocks xmlns:a="http://schemas.openxmlformats.org/drawingml/2006/main" noChangeAspect="1"/>
+            </wp:cNvGraphicFramePr>
+            <a:graphic xmlns:a="http://schemas.openxmlformats.org/drawingml/2006/main">
+              <a:graphicData uri="http://schemas.openxmlformats.org/drawingml/2006/picture">
+                <pic:pic xmlns:pic="http://schemas.openxmlformats.org/drawingml/2006/picture">
+                  <pic:nvPicPr>
+                    <pic:cNvPr id="855984060" name=""/>
+                    <pic:cNvPicPr/>
+                  </pic:nvPicPr>
+                  <pic:blipFill>
+                    <a:blip r:embed="rId9"/>
+                    <a:stretch>
+                      <a:fillRect/>
+                    </a:stretch>
+                  </pic:blipFill>
+                  <pic:spPr>
+                    <a:xfrm>
+                      <a:off x="0" y="0"/>
+                      <a:ext cx="5400040" cy="2856230"/>
+                    </a:xfrm>
+                    <a:prstGeom prst="rect">
+                      <a:avLst/>
+                    </a:prstGeom>
+                  </pic:spPr>
+                </pic:pic>
+              </a:graphicData>
+            </a:graphic>
+          </wp:inline>
+        </w:drawing>
+      </w:r>
+    </w:p>
+    <w:p>
+      <w:pPr>
+        <w:ind w:firstLine="708"/>
+        <w:jc w:val="both"/>
+        <w:rPr>
+          <w:rFonts w:ascii="Arial" w:hAnsi="Arial" w:cs="Arial"/>
+        </w:rPr>
+      </w:pPr>
+      <w:r>
+        <w:rPr>
+          <w:rFonts w:ascii="Arial" w:hAnsi="Arial" w:cs="Arial"/>
+        </w:rPr>
+        <w:t xml:space="preserve">Figura 3 – Gráfico de barras apresentando a distribuição </w:t>
+      </w:r>
+      <w:r>
+        <w:rPr>
+          <w:rFonts w:ascii="Arial" w:hAnsi="Arial" w:cs="Arial"/>
+        </w:rPr>
+        <w:t>dos rounds</w:t>
+      </w:r>
+      <w:r>
+        <w:rPr>
+          <w:rFonts w:ascii="Arial" w:hAnsi="Arial" w:cs="Arial"/>
+        </w:rPr>
+        <w:t xml:space="preserve"> em que as lutas acabam</w:t>
+      </w:r>
+    </w:p>
+    <w:p>
+      <w:pPr>
+        <w:ind w:firstLine="708"/>
+        <w:jc w:val="both"/>
+        <w:rPr>
+          <w:rFonts w:ascii="Arial" w:hAnsi="Arial" w:cs="Arial"/>
+        </w:rPr>
+      </w:pPr>
+      <w:r>
+        <w:rPr>
+          <w:rFonts w:ascii="Arial" w:hAnsi="Arial" w:cs="Arial"/>
+        </w:rPr>
+        <w:t xml:space="preserve">A figura </w:t>
+      </w:r>
+      <w:r>
+        <w:rPr>
+          <w:rFonts w:ascii="Arial" w:hAnsi="Arial" w:cs="Arial"/>
+        </w:rPr>
+        <w:t xml:space="preserve">3 </w:t>
+      </w:r>
+      <w:r>
+        <w:rPr>
+          <w:rFonts w:ascii="Arial" w:hAnsi="Arial" w:cs="Arial"/>
+        </w:rPr>
+        <w:t xml:space="preserve">apresenta a distribuição da variável ROUND, indicando a frequência de término das lutas em cada round. Observa-se que o terceiro round concentra a maior quantidade de ocorrências, sugerindo que uma parcela significativa das lutas chega ao limite regulamentar das disputas de três rounds. Em seguida, o primeiro round também apresenta alta frequência, indicando que muitos combates são finalizados rapidamente, geralmente por nocaute ou finalização. O segundo round possui uma frequência intermediária, enquanto </w:t>
+      </w:r>
+      <w:proofErr w:type="gramStart"/>
+      <w:r>
+        <w:rPr>
+          <w:rFonts w:ascii="Arial" w:hAnsi="Arial" w:cs="Arial"/>
+        </w:rPr>
+        <w:t>os quarto</w:t>
+      </w:r>
+      <w:proofErr w:type="gramEnd"/>
+      <w:r>
+        <w:rPr>
+          <w:rFonts w:ascii="Arial" w:hAnsi="Arial" w:cs="Arial"/>
+        </w:rPr>
+        <w:t xml:space="preserve"> e quinto rounds apresentam número significativamente menor de ocorrências, o que é esperado, pois apenas lutas principais ou disputas de cinturão são programadas para cinco rounds. Esses resultados evidenciam que a maioria das lutas termina nos três primeiros rounds, com concentração maior no terceiro.</w:t>
+      </w:r>
+    </w:p>
+    <w:p>
+      <w:pPr>
+        <w:jc w:val="both"/>
+        <w:rPr>
+          <w:rFonts w:ascii="Arial" w:hAnsi="Arial" w:cs="Arial"/>
+          <w:b/>
+          <w:bCs/>
+        </w:rPr>
+      </w:pPr>
+      <w:r>
+        <w:rPr>
+          <w:rFonts w:ascii="Arial" w:hAnsi="Arial" w:cs="Arial"/>
+          <w:b/>
+          <w:bCs/>
+        </w:rPr>
+        <w:t>Análise das estatísticas das colunas das bases de dados:</w:t>
+      </w:r>
+    </w:p>
+    <w:p>
+      <w:pPr>
+        <w:jc w:val="both"/>
+        <w:rPr>
+          <w:lang w:val="en-US"/>
+        </w:rPr>
+      </w:pPr>
+      <w:r>
+        <w:rPr>
+          <w:lang w:val="en-US"/>
+        </w:rPr>
         <w:t>Base: ufc_fight_results.csv</w:t>
       </w:r>
     </w:p>
@@ -8293,7 +8755,6 @@
               <w:rPr>
                 <w:b/>
               </w:rPr>
-              <w:lastRenderedPageBreak/>
               <w:t>Variável</w:t>
             </w:r>
           </w:p>
@@ -8982,6 +9443,7 @@
               </w:rPr>
             </w:pPr>
             <w:r>
+              <w:lastRenderedPageBreak/>
               <w:t>WEIGHTCLASS</w:t>
             </w:r>
           </w:p>
@@ -9537,6 +9999,32 @@
           <w:b/>
           <w:bCs/>
           <w:lang w:val="en-US"/>
+        </w:rPr>
+      </w:pPr>
+    </w:p>
+    <w:p>
+      <w:pPr>
+        <w:ind w:firstLine="708"/>
+        <w:jc w:val="both"/>
+      </w:pPr>
+      <w:r>
+        <w:t xml:space="preserve">A tabela apresenta estatísticas descritivas das principais variáveis presentes nas quatro bases de dados utilizadas no estudo. Na base ufc_fight_results.csv, que reúne informações gerais sobre os resultados das lutas, observa-se que não há valores nulos nas variáveis analisadas. O método de resultado mais frequente é Decision – </w:t>
+      </w:r>
+      <w:proofErr w:type="spellStart"/>
+      <w:r>
+        <w:t>Unanimous</w:t>
+      </w:r>
+      <w:proofErr w:type="spellEnd"/>
+      <w:r>
+        <w:t>, enquanto o round mais comum de término das lutas é o terceiro, com valores variando entre 1 e 5 e média de 2,35 rounds, indicando que grande parte dos combates se encerra relativamente cedo ou no limite das lutas de três rounds. A base contém 737 eventos e 7.358 lutas distintas, evidenciando ampla cobertura histórica.</w:t>
+      </w:r>
+    </w:p>
+    <w:p>
+      <w:pPr>
+        <w:jc w:val="both"/>
+        <w:rPr>
+          <w:b/>
+          <w:bCs/>
         </w:rPr>
       </w:pPr>
     </w:p>
@@ -10592,21 +11080,7 @@
                 <w:b/>
                 <w:bCs w:val="0"/>
               </w:rPr>
-              <w:t>16</w:t>
-            </w:r>
-            <w:r>
-              <w:rPr>
-                <w:b/>
-                <w:bCs w:val="0"/>
-              </w:rPr>
-              <w:t>,</w:t>
-            </w:r>
-            <w:r>
-              <w:rPr>
-                <w:b/>
-                <w:bCs w:val="0"/>
-              </w:rPr>
-              <w:t>19</w:t>
+              <w:t>16,19</w:t>
             </w:r>
           </w:p>
         </w:tc>
@@ -10789,21 +11263,7 @@
                 <w:b/>
                 <w:bCs w:val="0"/>
               </w:rPr>
-              <w:t>36</w:t>
-            </w:r>
-            <w:r>
-              <w:rPr>
-                <w:b/>
-                <w:bCs w:val="0"/>
-              </w:rPr>
-              <w:t>,</w:t>
-            </w:r>
-            <w:r>
-              <w:rPr>
-                <w:b/>
-                <w:bCs w:val="0"/>
-              </w:rPr>
-              <w:t>18</w:t>
+              <w:t>36,18</w:t>
             </w:r>
           </w:p>
         </w:tc>
@@ -10923,28 +11383,7 @@
                 <w:b/>
                 <w:bCs w:val="0"/>
               </w:rPr>
-              <w:t>50</w:t>
-            </w:r>
-            <w:r>
-              <w:rPr>
-                <w:b/>
-                <w:bCs w:val="0"/>
-              </w:rPr>
-              <w:t>,</w:t>
-            </w:r>
-            <w:r>
-              <w:rPr>
-                <w:b/>
-                <w:bCs w:val="0"/>
-              </w:rPr>
-              <w:t>0</w:t>
-            </w:r>
-            <w:r>
-              <w:rPr>
-                <w:b/>
-                <w:bCs w:val="0"/>
-              </w:rPr>
-              <w:t>%</w:t>
+              <w:t>50,0%</w:t>
             </w:r>
           </w:p>
         </w:tc>
@@ -10965,14 +11404,7 @@
                 <w:b/>
                 <w:bCs w:val="0"/>
               </w:rPr>
-              <w:t>0.0</w:t>
-            </w:r>
-            <w:r>
-              <w:rPr>
-                <w:b/>
-                <w:bCs w:val="0"/>
-              </w:rPr>
-              <w:t>%</w:t>
+              <w:t>0.0%</w:t>
             </w:r>
           </w:p>
         </w:tc>
@@ -10993,28 +11425,7 @@
                 <w:b/>
                 <w:bCs w:val="0"/>
               </w:rPr>
-              <w:t>100</w:t>
-            </w:r>
-            <w:r>
-              <w:rPr>
-                <w:b/>
-                <w:bCs w:val="0"/>
-              </w:rPr>
-              <w:t>,</w:t>
-            </w:r>
-            <w:r>
-              <w:rPr>
-                <w:b/>
-                <w:bCs w:val="0"/>
-              </w:rPr>
-              <w:t>0</w:t>
-            </w:r>
-            <w:r>
-              <w:rPr>
-                <w:b/>
-                <w:bCs w:val="0"/>
-              </w:rPr>
-              <w:t>%</w:t>
+              <w:t>100,0%</w:t>
             </w:r>
           </w:p>
         </w:tc>
@@ -11035,28 +11446,7 @@
                 <w:b/>
                 <w:bCs w:val="0"/>
               </w:rPr>
-              <w:t>45</w:t>
-            </w:r>
-            <w:r>
-              <w:rPr>
-                <w:b/>
-                <w:bCs w:val="0"/>
-              </w:rPr>
-              <w:t>,</w:t>
-            </w:r>
-            <w:r>
-              <w:rPr>
-                <w:b/>
-                <w:bCs w:val="0"/>
-              </w:rPr>
-              <w:t>277</w:t>
-            </w:r>
-            <w:r>
-              <w:rPr>
-                <w:b/>
-                <w:bCs w:val="0"/>
-              </w:rPr>
-              <w:t>%</w:t>
+              <w:t>45,277%</w:t>
             </w:r>
           </w:p>
         </w:tc>
@@ -11239,21 +11629,7 @@
                 <w:b/>
                 <w:bCs w:val="0"/>
               </w:rPr>
-              <w:t>23</w:t>
-            </w:r>
-            <w:r>
-              <w:rPr>
-                <w:b/>
-                <w:bCs w:val="0"/>
-              </w:rPr>
-              <w:t>,</w:t>
-            </w:r>
-            <w:r>
-              <w:rPr>
-                <w:b/>
-                <w:bCs w:val="0"/>
-              </w:rPr>
-              <w:t>56</w:t>
+              <w:t>23,56</w:t>
             </w:r>
           </w:p>
         </w:tc>
@@ -11436,21 +11812,7 @@
                 <w:b/>
                 <w:bCs w:val="0"/>
               </w:rPr>
-              <w:t>44</w:t>
-            </w:r>
-            <w:r>
-              <w:rPr>
-                <w:b/>
-                <w:bCs w:val="0"/>
-              </w:rPr>
-              <w:t>,</w:t>
-            </w:r>
-            <w:r>
-              <w:rPr>
-                <w:b/>
-                <w:bCs w:val="0"/>
-              </w:rPr>
-              <w:t>68</w:t>
+              <w:t>44,68</w:t>
             </w:r>
           </w:p>
         </w:tc>
@@ -11633,21 +11995,7 @@
                 <w:b/>
                 <w:bCs w:val="0"/>
               </w:rPr>
-              <w:t>0</w:t>
-            </w:r>
-            <w:r>
-              <w:rPr>
-                <w:b/>
-                <w:bCs w:val="0"/>
-              </w:rPr>
-              <w:t>,</w:t>
-            </w:r>
-            <w:r>
-              <w:rPr>
-                <w:b/>
-                <w:bCs w:val="0"/>
-              </w:rPr>
-              <w:t>45</w:t>
+              <w:t>0,45</w:t>
             </w:r>
           </w:p>
         </w:tc>
@@ -11746,6 +12094,7 @@
                 <w:sz w:val="22"/>
                 <w:szCs w:val="22"/>
               </w:rPr>
+              <w:lastRenderedPageBreak/>
               <w:t>TD ATTEMPTED</w:t>
             </w:r>
           </w:p>
@@ -11830,21 +12179,7 @@
                 <w:b/>
                 <w:bCs w:val="0"/>
               </w:rPr>
-              <w:t>1</w:t>
-            </w:r>
-            <w:r>
-              <w:rPr>
-                <w:b/>
-                <w:bCs w:val="0"/>
-              </w:rPr>
-              <w:t>,</w:t>
-            </w:r>
-            <w:r>
-              <w:rPr>
-                <w:b/>
-                <w:bCs w:val="0"/>
-              </w:rPr>
-              <w:t>20</w:t>
+              <w:t>1,20</w:t>
             </w:r>
           </w:p>
         </w:tc>
@@ -11985,28 +12320,7 @@
                 <w:b/>
                 <w:bCs w:val="0"/>
               </w:rPr>
-              <w:t>0</w:t>
-            </w:r>
-            <w:r>
-              <w:rPr>
-                <w:b/>
-                <w:bCs w:val="0"/>
-              </w:rPr>
-              <w:t>,</w:t>
-            </w:r>
-            <w:r>
-              <w:rPr>
-                <w:b/>
-                <w:bCs w:val="0"/>
-              </w:rPr>
-              <w:t>0</w:t>
-            </w:r>
-            <w:r>
-              <w:rPr>
-                <w:b/>
-                <w:bCs w:val="0"/>
-              </w:rPr>
-              <w:t>%</w:t>
+              <w:t>0,0%</w:t>
             </w:r>
           </w:p>
         </w:tc>
@@ -12027,28 +12341,7 @@
                 <w:b/>
                 <w:bCs w:val="0"/>
               </w:rPr>
-              <w:t>100</w:t>
-            </w:r>
-            <w:r>
-              <w:rPr>
-                <w:b/>
-                <w:bCs w:val="0"/>
-              </w:rPr>
-              <w:t>,</w:t>
-            </w:r>
-            <w:r>
-              <w:rPr>
-                <w:b/>
-                <w:bCs w:val="0"/>
-              </w:rPr>
-              <w:t>0</w:t>
-            </w:r>
-            <w:r>
-              <w:rPr>
-                <w:b/>
-                <w:bCs w:val="0"/>
-              </w:rPr>
-              <w:t>%</w:t>
+              <w:t>100,0%</w:t>
             </w:r>
           </w:p>
         </w:tc>
@@ -12069,28 +12362,7 @@
                 <w:b/>
                 <w:bCs w:val="0"/>
               </w:rPr>
-              <w:t>40</w:t>
-            </w:r>
-            <w:r>
-              <w:rPr>
-                <w:b/>
-                <w:bCs w:val="0"/>
-              </w:rPr>
-              <w:t>,</w:t>
-            </w:r>
-            <w:r>
-              <w:rPr>
-                <w:b/>
-                <w:bCs w:val="0"/>
-              </w:rPr>
-              <w:t>779</w:t>
-            </w:r>
-            <w:r>
-              <w:rPr>
-                <w:b/>
-                <w:bCs w:val="0"/>
-              </w:rPr>
-              <w:t>%</w:t>
+              <w:t>40,779%</w:t>
             </w:r>
           </w:p>
         </w:tc>
@@ -12111,21 +12383,7 @@
                 <w:b/>
                 <w:bCs w:val="0"/>
               </w:rPr>
-              <w:t>16902</w:t>
-            </w:r>
-            <w:r>
-              <w:rPr>
-                <w:b/>
-                <w:bCs w:val="0"/>
-              </w:rPr>
-              <w:t xml:space="preserve"> </w:t>
-            </w:r>
-            <w:r>
-              <w:rPr>
-                <w:b/>
-                <w:bCs w:val="0"/>
-              </w:rPr>
-              <w:t>(47 %)</w:t>
+              <w:t>16902 (47 %)</w:t>
             </w:r>
           </w:p>
         </w:tc>
@@ -12189,6 +12447,29 @@
         <w:rPr>
           <w:lang w:val="en-US"/>
         </w:rPr>
+      </w:pPr>
+    </w:p>
+    <w:p>
+      <w:pPr>
+        <w:ind w:firstLine="708"/>
+        <w:jc w:val="both"/>
+      </w:pPr>
+      <w:r>
+        <w:t>Na base ufc_fight_stats.csv, que detalha estatísticas por round e por lutador, também não há valores nulos na maioria das variáveis. As estatísticas de golpes indicam que a média de golpes significativos conectados é 16,19, a partir de 36,18 tentativas em média, resultando em uma precisão média de 45,28%. Em relação às quedas (</w:t>
+      </w:r>
+      <w:proofErr w:type="spellStart"/>
+      <w:r>
+        <w:t>takedowns</w:t>
+      </w:r>
+      <w:proofErr w:type="spellEnd"/>
+      <w:r>
+        <w:t>), a média é de 0,45 quedas aplicadas em 1,20 tentativas, com 40,78% de taxa média de sucesso. Contudo, essa variável apresenta 47% de valores nulos, sugerindo ausência de tentativas de queda em grande parte dos registros.</w:t>
+      </w:r>
+    </w:p>
+    <w:p>
+      <w:pPr>
+        <w:ind w:firstLine="708"/>
+        <w:jc w:val="both"/>
       </w:pPr>
     </w:p>
     <w:p>
@@ -12771,6 +13052,28 @@
     </w:p>
     <w:p>
       <w:pPr>
+        <w:ind w:firstLine="708"/>
+        <w:jc w:val="both"/>
+      </w:pPr>
+      <w:r>
+        <w:t>A base ufc_fighter_tott.csv contém informações individuais dos lutadores. Foram identificados 2.473 lutadores distintos, sendo a maioria dos nomes exclusivos, indicando baixa repetição. A variável disponível nesta base refere-se ao alcance (</w:t>
+      </w:r>
+      <w:proofErr w:type="spellStart"/>
+      <w:r>
+        <w:t>reach</w:t>
+      </w:r>
+      <w:proofErr w:type="spellEnd"/>
+      <w:r>
+        <w:t>) dos atletas, com 27 valores distintos, representando diferentes medidas de envergadura entre os lutadores.</w:t>
+      </w:r>
+    </w:p>
+    <w:p>
+      <w:pPr>
+        <w:jc w:val="both"/>
+      </w:pPr>
+    </w:p>
+    <w:p>
+      <w:pPr>
         <w:jc w:val="both"/>
         <w:rPr>
           <w:lang w:val="en-US"/>
@@ -13371,6 +13674,37 @@
     </w:p>
     <w:p>
       <w:pPr>
+        <w:ind w:firstLine="708"/>
+        <w:jc w:val="both"/>
+        <w:rPr>
+          <w:rFonts w:ascii="Arial" w:hAnsi="Arial" w:cs="Arial"/>
+        </w:rPr>
+      </w:pPr>
+      <w:r>
+        <w:rPr>
+          <w:rFonts w:ascii="Arial" w:hAnsi="Arial" w:cs="Arial"/>
+        </w:rPr>
+        <w:t xml:space="preserve">Por fim, a base ufc_event_details.csv reúne informações sobre os eventos. Foram identificados 764 eventos distintos, cada um associado a uma data específica, com 759 datas diferentes registradas e ausência de valores </w:t>
+      </w:r>
+      <w:r>
+        <w:rPr>
+          <w:rFonts w:ascii="Arial" w:hAnsi="Arial" w:cs="Arial"/>
+        </w:rPr>
+        <w:lastRenderedPageBreak/>
+        <w:t>nulos. Esses dados complementam as demais bases ao fornecer o contexto temporal dos combates analisados.</w:t>
+      </w:r>
+    </w:p>
+    <w:p>
+      <w:pPr>
+        <w:rPr>
+          <w:rFonts w:ascii="Arial" w:hAnsi="Arial" w:cs="Arial"/>
+          <w:b/>
+          <w:bCs/>
+        </w:rPr>
+      </w:pPr>
+    </w:p>
+    <w:p>
+      <w:pPr>
         <w:rPr>
           <w:rFonts w:ascii="Arial" w:hAnsi="Arial" w:cs="Arial"/>
           <w:b/>
@@ -13987,7 +14321,6 @@
               <w:rPr>
                 <w:rFonts w:ascii="Arial" w:hAnsi="Arial" w:cs="Arial"/>
               </w:rPr>
-              <w:lastRenderedPageBreak/>
               <w:t>Registros</w:t>
             </w:r>
           </w:p>
@@ -14366,7 +14699,14 @@
         <w:rPr>
           <w:rFonts w:ascii="Arial" w:hAnsi="Arial" w:cs="Arial"/>
         </w:rPr>
-        <w:t xml:space="preserve"> corresponde a atletas com poucas ou nenhuma luta registrada no período analisado, muitos deles de eventos antigos dos anos 1990 e início dos anos 2000, quando o registro de dados físicos dos atletas ainda não era padronizado pela organização. Isso explica por que a remoção de quase metade dos lutadores resultou na exclusão de apenas 12,7% das lutas — os lutadores removidos tinham baixa participação no volume total de confrontos.</w:t>
+        <w:t xml:space="preserve"> corresponde a atletas com poucas ou nenhuma luta registrada no período analisado, muitos deles de eventos antigos dos anos 1990 e início dos anos 2000, quando o registro de dados físicos dos atletas ainda não era padronizado pela organização. Isso explica por que a remoção de quase metade dos </w:t>
+      </w:r>
+      <w:r>
+        <w:rPr>
+          <w:rFonts w:ascii="Arial" w:hAnsi="Arial" w:cs="Arial"/>
+        </w:rPr>
+        <w:lastRenderedPageBreak/>
+        <w:t>lutadores resultou na exclusão de apenas 12,7% das lutas — os lutadores removidos tinham baixa participação no volume total de confrontos.</w:t>
       </w:r>
     </w:p>
     <w:p>
@@ -14540,7 +14880,6 @@
           <w:bCs/>
           <w:noProof/>
         </w:rPr>
-        <w:lastRenderedPageBreak/>
         <w:drawing>
           <wp:anchor distT="0" distB="0" distL="114300" distR="114300" simplePos="0" relativeHeight="251658240" behindDoc="0" locked="0" layoutInCell="1" allowOverlap="1" wp14:anchorId="1FAF6505" wp14:editId="1DB207D6">
             <wp:simplePos x="0" y="0"/>
@@ -14565,7 +14904,7 @@
                     <pic:cNvPicPr/>
                   </pic:nvPicPr>
                   <pic:blipFill>
-                    <a:blip r:embed="rId7">
+                    <a:blip r:embed="rId10">
                       <a:extLst>
                         <a:ext uri="{28A0092B-C50C-407E-A947-70E740481C1C}">
                           <a14:useLocalDpi xmlns:a14="http://schemas.microsoft.com/office/drawing/2010/main" val="0"/>
@@ -14705,6 +15044,7 @@
           <w:b/>
           <w:bCs/>
         </w:rPr>
+        <w:lastRenderedPageBreak/>
         <w:t>SCH_UFC_001.DIM_EVENTO:</w:t>
       </w:r>
       <w:r>
@@ -14900,7 +15240,6 @@
           <w:b/>
           <w:bCs/>
         </w:rPr>
-        <w:lastRenderedPageBreak/>
         <w:t>SCH_UFC_001.FATO_ROUND_LUTA:</w:t>
       </w:r>
       <w:r>
@@ -15548,6 +15887,7 @@
                 <w:color w:val="000000"/>
                 <w:szCs w:val="24"/>
               </w:rPr>
+              <w:lastRenderedPageBreak/>
               <w:t>DIM_TEMPO</w:t>
             </w:r>
           </w:p>
@@ -16758,7 +17098,6 @@
                 <w:color w:val="000000"/>
                 <w:szCs w:val="24"/>
               </w:rPr>
-              <w:lastRenderedPageBreak/>
               <w:t>DIM_LUTADOR</w:t>
             </w:r>
           </w:p>
@@ -17857,6 +18196,7 @@
                 <w:color w:val="000000"/>
                 <w:szCs w:val="24"/>
               </w:rPr>
+              <w:lastRenderedPageBreak/>
               <w:t>FATO_ROUND_LUTA</w:t>
             </w:r>
           </w:p>
@@ -18729,7 +19069,6 @@
                 <w:color w:val="000000"/>
                 <w:szCs w:val="24"/>
               </w:rPr>
-              <w:lastRenderedPageBreak/>
               <w:t>FATO_ROUND_LUTA</w:t>
             </w:r>
           </w:p>
@@ -19070,7 +19409,7 @@
         </w:rPr>
         <w:t xml:space="preserve">Disponível em: </w:t>
       </w:r>
-      <w:hyperlink r:id="rId8" w:history="1">
+      <w:hyperlink r:id="rId11" w:history="1">
         <w:r>
           <w:rPr>
             <w:rStyle w:val="Hyperlink"/>
@@ -19127,7 +19466,7 @@
         </w:rPr>
         <w:t xml:space="preserve"> no Brasil | UFC.COM.BR. Disponível em: </w:t>
       </w:r>
-      <w:hyperlink r:id="rId9" w:history="1">
+      <w:hyperlink r:id="rId12" w:history="1">
         <w:r>
           <w:rPr>
             <w:rStyle w:val="Hyperlink"/>
@@ -19156,7 +19495,7 @@
         </w:rPr>
         <w:t xml:space="preserve">O que é um Data Warehouse? Disponível em: </w:t>
       </w:r>
-      <w:hyperlink r:id="rId10" w:history="1">
+      <w:hyperlink r:id="rId13" w:history="1">
         <w:r>
           <w:rPr>
             <w:rStyle w:val="Hyperlink"/>
@@ -19229,7 +19568,7 @@
         </w:rPr>
         <w:t xml:space="preserve"> | UFC. Disponível em: </w:t>
       </w:r>
-      <w:hyperlink r:id="rId11" w:history="1">
+      <w:hyperlink r:id="rId14" w:history="1">
         <w:r>
           <w:rPr>
             <w:rStyle w:val="Hyperlink"/>
@@ -19294,7 +19633,7 @@
         </w:rPr>
         <w:t xml:space="preserve">? Disponível em: </w:t>
       </w:r>
-      <w:hyperlink r:id="rId12" w:history="1">
+      <w:hyperlink r:id="rId15" w:history="1">
         <w:r>
           <w:rPr>
             <w:rStyle w:val="Hyperlink"/>

</xml_diff>